<commit_message>
update Sun Aug 31 16:00:24 PDT 2025
</commit_message>
<xml_diff>
--- a/cv.docx
+++ b/cv.docx
@@ -882,73 +882,7 @@
                 <w:kern w:val="0"/>
                 <w:lang w:val="en-US" w:eastAsia="en-US" w:bidi="ar-SA"/>
               </w:rPr>
-              <w:t xml:space="preserve">Responsible for </w:t>
-            </w:r>
-            <w:r>
-              <w:rPr>
-                <w:rFonts w:eastAsia="ＭＳ 明朝" w:ascii="Palatino Linotype" w:hAnsi="Palatino Linotype"/>
-                <w:b w:val="false"/>
-                <w:bCs w:val="false"/>
-                <w:color w:val="000000"/>
-                <w:kern w:val="0"/>
-                <w:lang w:val="en-US" w:eastAsia="en-US" w:bidi="ar-SA"/>
-              </w:rPr>
-              <w:t xml:space="preserve">diffusion, </w:t>
-            </w:r>
-            <w:r>
-              <w:rPr>
-                <w:rFonts w:eastAsia="ＭＳ 明朝" w:ascii="Palatino Linotype" w:hAnsi="Palatino Linotype"/>
-                <w:b w:val="false"/>
-                <w:bCs w:val="false"/>
-                <w:color w:val="000000"/>
-                <w:kern w:val="0"/>
-                <w:lang w:val="en-US" w:eastAsia="en-US" w:bidi="ar-SA"/>
-              </w:rPr>
-              <w:t xml:space="preserve">semantic segmentation, </w:t>
-            </w:r>
-            <w:r>
-              <w:rPr>
-                <w:rFonts w:eastAsia="ＭＳ 明朝" w:ascii="Palatino Linotype" w:hAnsi="Palatino Linotype"/>
-                <w:b w:val="false"/>
-                <w:bCs w:val="false"/>
-                <w:color w:val="000000"/>
-                <w:kern w:val="0"/>
-                <w:lang w:val="en-US" w:eastAsia="en-US" w:bidi="ar-SA"/>
-              </w:rPr>
-              <w:t xml:space="preserve">and </w:t>
-            </w:r>
-            <w:r>
-              <w:rPr>
-                <w:rFonts w:eastAsia="ＭＳ 明朝" w:ascii="Palatino Linotype" w:hAnsi="Palatino Linotype"/>
-                <w:b w:val="false"/>
-                <w:bCs w:val="false"/>
-                <w:color w:val="000000"/>
-                <w:kern w:val="0"/>
-                <w:lang w:val="en-US" w:eastAsia="en-US" w:bidi="ar-SA"/>
-              </w:rPr>
-              <w:t>detection</w:t>
-            </w:r>
-            <w:r>
-              <w:rPr>
-                <w:rFonts w:eastAsia="ＭＳ 明朝" w:ascii="Palatino Linotype" w:hAnsi="Palatino Linotype"/>
-                <w:b w:val="false"/>
-                <w:bCs w:val="false"/>
-                <w:color w:val="000000"/>
-                <w:kern w:val="0"/>
-                <w:lang w:val="en-US" w:eastAsia="en-US" w:bidi="ar-SA"/>
-              </w:rPr>
-              <w:t xml:space="preserve"> </w:t>
-            </w:r>
-            <w:r>
-              <w:rPr>
-                <w:rFonts w:eastAsia="ＭＳ 明朝" w:ascii="Palatino Linotype" w:hAnsi="Palatino Linotype"/>
-                <w:b w:val="false"/>
-                <w:bCs w:val="false"/>
-                <w:color w:val="000000"/>
-                <w:kern w:val="0"/>
-                <w:lang w:val="en-US" w:eastAsia="en-US" w:bidi="ar-SA"/>
-              </w:rPr>
-              <w:t>models being run on imagery at world scale</w:t>
+              <w:t>Responsible for diffusion, semantic segmentation, and detection models being run on imagery at world scale</w:t>
             </w:r>
           </w:p>
           <w:p>
@@ -1142,7 +1076,25 @@
                 <w:kern w:val="0"/>
                 <w:lang w:val="en-US" w:eastAsia="en-US" w:bidi="ar-SA"/>
               </w:rPr>
-              <w:t>Oversee a team of 5 engineers serving as both a manager and a contributor for several major projects</w:t>
+              <w:t>Overs</w:t>
+            </w:r>
+            <w:r>
+              <w:rPr>
+                <w:rFonts w:ascii="Palatino Linotype" w:hAnsi="Palatino Linotype"/>
+                <w:color w:val="000000"/>
+                <w:kern w:val="0"/>
+                <w:lang w:val="en-US" w:eastAsia="en-US" w:bidi="ar-SA"/>
+              </w:rPr>
+              <w:t>aw</w:t>
+            </w:r>
+            <w:r>
+              <w:rPr>
+                <w:rFonts w:ascii="Palatino Linotype" w:hAnsi="Palatino Linotype"/>
+                <w:color w:val="000000"/>
+                <w:kern w:val="0"/>
+                <w:lang w:val="en-US" w:eastAsia="en-US" w:bidi="ar-SA"/>
+              </w:rPr>
+              <w:t xml:space="preserve"> a team of 5 engineers serving as both a manager and a contributor for several major projects</w:t>
             </w:r>
           </w:p>
           <w:p>
@@ -8135,7 +8087,7 @@
     <w:pPr>
       <w:widowControl/>
       <w:suppressAutoHyphens w:val="true"/>
-      <w:overflowPunct w:val="true"/>
+      <w:overflowPunct w:val="false"/>
       <w:bidi w:val="0"/>
       <w:spacing w:lineRule="auto" w:line="240" w:before="0" w:after="0"/>
       <w:jc w:val="left"/>
@@ -8472,7 +8424,7 @@
     <w:pPr>
       <w:widowControl/>
       <w:suppressAutoHyphens w:val="true"/>
-      <w:overflowPunct w:val="true"/>
+      <w:overflowPunct w:val="false"/>
       <w:bidi w:val="0"/>
       <w:spacing w:lineRule="auto" w:line="240" w:before="0" w:after="0"/>
       <w:jc w:val="left"/>

</xml_diff>